<commit_message>
Deploying to gh-pages from @ d-morrison/macros@96484d212274e4f144cd4ff80f9b785098a11dc9 🚀
</commit_message>
<xml_diff>
--- a/demo-include-in-header.docx
+++ b/demo-include-in-header.docx
@@ -1540,6 +1540,448 @@
       </w:tr>
     </w:tbl>
     <w:bookmarkEnd w:id="10"/>
+    <w:bookmarkStart w:id="13" w:name="color-macros"/>
+    <w:p>
+      <w:pPr>
+        <w:pStyle w:val="Heading2"/>
+      </w:pPr>
+      <w:r>
+        <w:t xml:space="preserve">Color macros</w:t>
+      </w:r>
+    </w:p>
+    <w:p>
+      <w:pPr>
+        <w:pStyle w:val="FirstParagraph"/>
+      </w:pPr>
+      <w:r>
+        <w:rPr>
+          <w:rStyle w:val="VerbatimChar"/>
+        </w:rPr>
+        <w:t xml:space="preserve">macros.qmd</w:t>
+      </w:r>
+      <w:r>
+        <w:t xml:space="preserve"> </w:t>
+      </w:r>
+      <w:r>
+        <w:t xml:space="preserve">defines a one-argument macro for each of the 19</w:t>
+      </w:r>
+      <w:r>
+        <w:t xml:space="preserve"> </w:t>
+      </w:r>
+      <w:hyperlink r:id="rId11">
+        <w:r>
+          <w:rPr>
+            <w:rStyle w:val="Hyperlink"/>
+          </w:rPr>
+          <w:t xml:space="preserve">LaTeX base colors</w:t>
+        </w:r>
+      </w:hyperlink>
+      <w:r>
+        <w:t xml:space="preserve"> </w:t>
+      </w:r>
+      <w:r>
+        <w:t xml:space="preserve">(</w:t>
+      </w:r>
+      <w:r>
+        <w:rPr>
+          <w:rStyle w:val="VerbatimChar"/>
+        </w:rPr>
+        <w:t xml:space="preserve">\red</w:t>
+      </w:r>
+      <w:r>
+        <w:t xml:space="preserve">,</w:t>
+      </w:r>
+      <w:r>
+        <w:t xml:space="preserve"> </w:t>
+      </w:r>
+      <w:r>
+        <w:rPr>
+          <w:rStyle w:val="VerbatimChar"/>
+        </w:rPr>
+        <w:t xml:space="preserve">\blue</w:t>
+      </w:r>
+      <w:r>
+        <w:t xml:space="preserve">,</w:t>
+      </w:r>
+      <w:r>
+        <w:t xml:space="preserve"> </w:t>
+      </w:r>
+      <w:r>
+        <w:rPr>
+          <w:rStyle w:val="VerbatimChar"/>
+        </w:rPr>
+        <w:t xml:space="preserve">\green</w:t>
+      </w:r>
+      <w:r>
+        <w:t xml:space="preserve">,</w:t>
+      </w:r>
+      <w:r>
+        <w:t xml:space="preserve"> </w:t>
+      </w:r>
+      <w:r>
+        <w:rPr>
+          <w:rStyle w:val="VerbatimChar"/>
+        </w:rPr>
+        <w:t xml:space="preserve">\orange</w:t>
+      </w:r>
+      <w:r>
+        <w:t xml:space="preserve">, …), using the</w:t>
+      </w:r>
+      <w:r>
+        <w:t xml:space="preserve"> </w:t>
+      </w:r>
+      <w:r>
+        <w:rPr>
+          <w:rStyle w:val="VerbatimChar"/>
+        </w:rPr>
+        <w:t xml:space="preserve">\color</w:t>
+      </w:r>
+      <w:r>
+        <w:t xml:space="preserve"> </w:t>
+      </w:r>
+      <w:r>
+        <w:t xml:space="preserve">switch form (</w:t>
+      </w:r>
+      <w:r>
+        <w:rPr>
+          <w:rStyle w:val="VerbatimChar"/>
+        </w:rPr>
+        <w:t xml:space="preserve">{\color{red}{#1}}</w:t>
+      </w:r>
+      <w:r>
+        <w:t xml:space="preserve">), which is supported by MathJax (HTML/RevealJS) and lualatex (PDF):</w:t>
+      </w:r>
+    </w:p>
+    <w:tbl>
+      <w:tblPr>
+        <w:tblStyle w:val="Table"/>
+        <w:tblW w:type="pct" w:w="5000"/>
+        <w:tblLayout w:type="fixed"/>
+        <w:tblLook w:firstRow="1" w:lastRow="0" w:firstColumn="0" w:lastColumn="0" w:noHBand="0" w:noVBand="0" w:val="0020"/>
+      </w:tblPr>
+      <w:tblGrid>
+        <w:gridCol w:w="2640"/>
+        <w:gridCol w:w="2640"/>
+        <w:gridCol w:w="2640"/>
+      </w:tblGrid>
+      <w:tr>
+        <w:trPr>
+          <w:tblHeader w:val="on"/>
+        </w:trPr>
+        <w:tc>
+          <w:tcPr/>
+          <w:p>
+            <w:pPr>
+              <w:pStyle w:val="Compact"/>
+            </w:pPr>
+            <w:r>
+              <w:t xml:space="preserve">Description</w:t>
+            </w:r>
+          </w:p>
+        </w:tc>
+        <w:tc>
+          <w:tcPr/>
+          <w:p>
+            <w:pPr>
+              <w:pStyle w:val="Compact"/>
+            </w:pPr>
+            <w:r>
+              <w:t xml:space="preserve">Code</w:t>
+            </w:r>
+          </w:p>
+        </w:tc>
+        <w:tc>
+          <w:tcPr/>
+          <w:p>
+            <w:pPr>
+              <w:pStyle w:val="Compact"/>
+            </w:pPr>
+            <w:r>
+              <w:t xml:space="preserve">Output</w:t>
+            </w:r>
+          </w:p>
+        </w:tc>
+      </w:tr>
+      <w:tr>
+        <w:tc>
+          <w:tcPr/>
+          <w:p>
+            <w:pPr>
+              <w:pStyle w:val="Compact"/>
+            </w:pPr>
+            <w:r>
+              <w:t xml:space="preserve">Red</w:t>
+            </w:r>
+          </w:p>
+        </w:tc>
+        <w:tc>
+          <w:tcPr/>
+          <w:p>
+            <w:pPr>
+              <w:pStyle w:val="Compact"/>
+            </w:pPr>
+            <w:r>
+              <w:rPr>
+                <w:rStyle w:val="VerbatimChar"/>
+              </w:rPr>
+              <w:t xml:space="preserve">\red{x}</w:t>
+            </w:r>
+          </w:p>
+        </w:tc>
+        <w:tc>
+          <w:tcPr/>
+          <w:p>
+            <w:pPr>
+              <w:pStyle w:val="Compact"/>
+            </w:pPr>
+            <w:r>
+              <w:t xml:space="preserve">$\red{x}$</w:t>
+            </w:r>
+          </w:p>
+        </w:tc>
+      </w:tr>
+      <w:tr>
+        <w:tc>
+          <w:tcPr/>
+          <w:p>
+            <w:pPr>
+              <w:pStyle w:val="Compact"/>
+            </w:pPr>
+            <w:r>
+              <w:t xml:space="preserve">Blue</w:t>
+            </w:r>
+          </w:p>
+        </w:tc>
+        <w:tc>
+          <w:tcPr/>
+          <w:p>
+            <w:pPr>
+              <w:pStyle w:val="Compact"/>
+            </w:pPr>
+            <w:r>
+              <w:rPr>
+                <w:rStyle w:val="VerbatimChar"/>
+              </w:rPr>
+              <w:t xml:space="preserve">\blue{y}</w:t>
+            </w:r>
+          </w:p>
+        </w:tc>
+        <w:tc>
+          <w:tcPr/>
+          <w:p>
+            <w:pPr>
+              <w:pStyle w:val="Compact"/>
+            </w:pPr>
+            <w:r>
+              <w:t xml:space="preserve">$\blue{y}$</w:t>
+            </w:r>
+          </w:p>
+        </w:tc>
+      </w:tr>
+      <w:tr>
+        <w:tc>
+          <w:tcPr/>
+          <w:p>
+            <w:pPr>
+              <w:pStyle w:val="Compact"/>
+            </w:pPr>
+            <w:r>
+              <w:t xml:space="preserve">Green</w:t>
+            </w:r>
+          </w:p>
+        </w:tc>
+        <w:tc>
+          <w:tcPr/>
+          <w:p>
+            <w:pPr>
+              <w:pStyle w:val="Compact"/>
+            </w:pPr>
+            <w:r>
+              <w:rPr>
+                <w:rStyle w:val="VerbatimChar"/>
+              </w:rPr>
+              <w:t xml:space="preserve">\green{z}</w:t>
+            </w:r>
+          </w:p>
+        </w:tc>
+        <w:tc>
+          <w:tcPr/>
+          <w:p>
+            <w:pPr>
+              <w:pStyle w:val="Compact"/>
+            </w:pPr>
+            <w:r>
+              <w:t xml:space="preserve">$\green{z}$</w:t>
+            </w:r>
+          </w:p>
+        </w:tc>
+      </w:tr>
+      <w:tr>
+        <w:tc>
+          <w:tcPr/>
+          <w:p>
+            <w:pPr>
+              <w:pStyle w:val="Compact"/>
+            </w:pPr>
+            <w:r>
+              <w:t xml:space="preserve">Orange</w:t>
+            </w:r>
+          </w:p>
+        </w:tc>
+        <w:tc>
+          <w:tcPr/>
+          <w:p>
+            <w:pPr>
+              <w:pStyle w:val="Compact"/>
+            </w:pPr>
+            <w:r>
+              <w:rPr>
+                <w:rStyle w:val="VerbatimChar"/>
+              </w:rPr>
+              <w:t xml:space="preserve">\orange{\mu}</w:t>
+            </w:r>
+          </w:p>
+        </w:tc>
+        <w:tc>
+          <w:tcPr/>
+          <w:p>
+            <w:pPr>
+              <w:pStyle w:val="Compact"/>
+            </w:pPr>
+            <w:r>
+              <w:t xml:space="preserve">$\orange{\mu}$</w:t>
+            </w:r>
+          </w:p>
+        </w:tc>
+      </w:tr>
+      <w:tr>
+        <w:tc>
+          <w:tcPr/>
+          <w:p>
+            <w:pPr>
+              <w:pStyle w:val="Compact"/>
+            </w:pPr>
+            <w:r>
+              <w:t xml:space="preserve">Combined</w:t>
+            </w:r>
+          </w:p>
+        </w:tc>
+        <w:tc>
+          <w:tcPr/>
+          <w:p>
+            <w:pPr>
+              <w:pStyle w:val="Compact"/>
+            </w:pPr>
+            <w:r>
+              <w:rPr>
+                <w:rStyle w:val="VerbatimChar"/>
+              </w:rPr>
+              <w:t xml:space="preserve">\red{x} + \blue{y} = \green{z}</w:t>
+            </w:r>
+          </w:p>
+        </w:tc>
+        <w:tc>
+          <w:tcPr/>
+          <w:p>
+            <w:pPr>
+              <w:pStyle w:val="Compact"/>
+            </w:pPr>
+            <w:r>
+              <w:t xml:space="preserve">$\red{x} + \blue{y} = \green{z}$</w:t>
+            </w:r>
+          </w:p>
+        </w:tc>
+      </w:tr>
+      <w:tr>
+        <w:tc>
+          <w:tcPr/>
+          <w:p>
+            <w:pPr>
+              <w:pStyle w:val="Compact"/>
+            </w:pPr>
+            <w:r>
+              <w:t xml:space="preserve">Nested macros</w:t>
+            </w:r>
+          </w:p>
+        </w:tc>
+        <w:tc>
+          <w:tcPr/>
+          <w:p>
+            <w:pPr>
+              <w:pStyle w:val="Compact"/>
+            </w:pPr>
+            <w:r>
+              <w:rPr>
+                <w:rStyle w:val="VerbatimChar"/>
+              </w:rPr>
+              <w:t xml:space="preserve">X_i \sim_{\red{\ind}} \blue{\Normal}(\orange{\mu_i}, \green{\ss})</w:t>
+            </w:r>
+          </w:p>
+        </w:tc>
+        <w:tc>
+          <w:tcPr/>
+          <w:p>
+            <w:pPr>
+              <w:pStyle w:val="Compact"/>
+            </w:pPr>
+            <w:r>
+              <w:t xml:space="preserve">$X_i \sim_{\red{\ind}} \blue{\Normal}(\orange{\mu_i}, \green{\ss})$</w:t>
+            </w:r>
+          </w:p>
+        </w:tc>
+      </w:tr>
+    </w:tbl>
+    <w:p>
+      <w:pPr>
+        <w:pStyle w:val="BlockText"/>
+      </w:pPr>
+      <w:r>
+        <w:rPr>
+          <w:b/>
+          <w:bCs/>
+        </w:rPr>
+        <w:t xml:space="preserve">Note (docx):</w:t>
+      </w:r>
+      <w:r>
+        <w:t xml:space="preserve"> </w:t>
+      </w:r>
+      <w:r>
+        <w:t xml:space="preserve">as described above, the</w:t>
+      </w:r>
+      <w:r>
+        <w:t xml:space="preserve"> </w:t>
+      </w:r>
+      <w:r>
+        <w:rPr>
+          <w:rStyle w:val="VerbatimChar"/>
+        </w:rPr>
+        <w:t xml:space="preserve">include-in-header</w:t>
+      </w:r>
+      <w:r>
+        <w:t xml:space="preserve"> </w:t>
+      </w:r>
+      <w:r>
+        <w:t xml:space="preserve">strategy does not load macros for docx output, so the color macros (like all other macros) are unavailable there. For docx, use the</w:t>
+      </w:r>
+      <w:r>
+        <w:t xml:space="preserve"> </w:t>
+      </w:r>
+      <w:hyperlink r:id="rId12">
+        <w:r>
+          <w:rPr>
+            <w:rStyle w:val="Hyperlink"/>
+          </w:rPr>
+          <w:t xml:space="preserve">include shortcode strategy</w:t>
+        </w:r>
+      </w:hyperlink>
+      <w:r>
+        <w:t xml:space="preserve"> </w:t>
+      </w:r>
+      <w:r>
+        <w:t xml:space="preserve">instead.</w:t>
+      </w:r>
+    </w:p>
+    <w:bookmarkEnd w:id="13"/>
     <w:sectPr>
       <w:footnotePr>
         <w:numRestart w:val="eachSect"/>

</xml_diff>

<commit_message>
Deploying to gh-pages from @ d-morrison/macros@0d1a939f884c01ec4de116b673cce7587f03eb23 🚀
</commit_message>
<xml_diff>
--- a/demo-include-in-header.docx
+++ b/demo-include-in-header.docx
@@ -1190,9 +1190,11 @@
             <w:pPr>
               <w:pStyle w:val="Compact"/>
             </w:pPr>
-            <w:r>
-              <w:t xml:space="preserve">$\a$</w:t>
-            </w:r>
+            <m:oMath>
+              <m:r>
+                <m:t>α</m:t>
+              </m:r>
+            </m:oMath>
           </w:p>
         </w:tc>
       </w:tr>
@@ -1228,9 +1230,11 @@
             <w:pPr>
               <w:pStyle w:val="Compact"/>
             </w:pPr>
-            <w:r>
-              <w:t xml:space="preserve">$\b$</w:t>
-            </w:r>
+            <m:oMath>
+              <m:r>
+                <m:t>β</m:t>
+              </m:r>
+            </m:oMath>
           </w:p>
         </w:tc>
       </w:tr>
@@ -1266,9 +1270,11 @@
             <w:pPr>
               <w:pStyle w:val="Compact"/>
             </w:pPr>
-            <w:r>
-              <w:t xml:space="preserve">$\g$</w:t>
-            </w:r>
+            <m:oMath>
+              <m:r>
+                <m:t>γ</m:t>
+              </m:r>
+            </m:oMath>
           </w:p>
         </w:tc>
       </w:tr>
@@ -1304,9 +1310,11 @@
             <w:pPr>
               <w:pStyle w:val="Compact"/>
             </w:pPr>
-            <w:r>
-              <w:t xml:space="preserve">$\l$</w:t>
-            </w:r>
+            <m:oMath>
+              <m:r>
+                <m:t>λ</m:t>
+              </m:r>
+            </m:oMath>
           </w:p>
         </w:tc>
       </w:tr>
@@ -1342,9 +1350,11 @@
             <w:pPr>
               <w:pStyle w:val="Compact"/>
             </w:pPr>
-            <w:r>
-              <w:t xml:space="preserve">$\s$</w:t>
-            </w:r>
+            <m:oMath>
+              <m:r>
+                <m:t>σ</m:t>
+              </m:r>
+            </m:oMath>
           </w:p>
         </w:tc>
       </w:tr>
@@ -1380,9 +1390,11 @@
             <w:pPr>
               <w:pStyle w:val="Compact"/>
             </w:pPr>
-            <w:r>
-              <w:t xml:space="preserve">$\llik$</w:t>
-            </w:r>
+            <m:oMath>
+              <m:r>
+                <m:t>ℓ</m:t>
+              </m:r>
+            </m:oMath>
           </w:p>
         </w:tc>
       </w:tr>
@@ -1418,9 +1430,35 @@
             <w:pPr>
               <w:pStyle w:val="Compact"/>
             </w:pPr>
-            <w:r>
-              <w:t xml:space="preserve">$X \ind Y$</w:t>
-            </w:r>
+            <m:oMath>
+              <m:r>
+                <m:t>X</m:t>
+              </m:r>
+              <m:r>
+                <m:rPr>
+                  <m:sty m:val="p"/>
+                </m:rPr>
+                <m:t>⟂</m:t>
+              </m:r>
+              <m:r>
+                <m:t>​</m:t>
+              </m:r>
+              <m:r>
+                <m:t>​</m:t>
+              </m:r>
+              <m:r>
+                <m:t>​</m:t>
+              </m:r>
+              <m:r>
+                <m:rPr>
+                  <m:sty m:val="p"/>
+                </m:rPr>
+                <m:t>⟂</m:t>
+              </m:r>
+              <m:r>
+                <m:t>Y</m:t>
+              </m:r>
+            </m:oMath>
           </w:p>
         </w:tc>
       </w:tr>
@@ -1456,9 +1494,83 @@
             <w:pPr>
               <w:pStyle w:val="Compact"/>
             </w:pPr>
-            <w:r>
-              <w:t xml:space="preserve">$X_i \siid \Normal(\m, \ss)$</w:t>
-            </w:r>
+            <m:oMath>
+              <m:sSub>
+                <m:e>
+                  <m:r>
+                    <m:t>X</m:t>
+                  </m:r>
+                </m:e>
+                <m:sub>
+                  <m:r>
+                    <m:t>i</m:t>
+                  </m:r>
+                </m:sub>
+              </m:sSub>
+              <m:r>
+                <m:t> </m:t>
+              </m:r>
+              <m:sSub>
+                <m:e>
+                  <m:r>
+                    <m:rPr>
+                      <m:sty m:val="p"/>
+                    </m:rPr>
+                    <m:t>∼</m:t>
+                  </m:r>
+                </m:e>
+                <m:sub>
+                  <m:r>
+                    <m:rPr>
+                      <m:sty m:val="p"/>
+                    </m:rPr>
+                    <m:t>iid</m:t>
+                  </m:r>
+                </m:sub>
+              </m:sSub>
+              <m:r>
+                <m:t> </m:t>
+              </m:r>
+              <m:r>
+                <m:rPr>
+                  <m:sty m:val="p"/>
+                </m:rPr>
+                <m:t>N</m:t>
+              </m:r>
+              <m:r>
+                <m:rPr>
+                  <m:sty m:val="p"/>
+                </m:rPr>
+                <m:t>(</m:t>
+              </m:r>
+              <m:r>
+                <m:t>μ</m:t>
+              </m:r>
+              <m:r>
+                <m:rPr>
+                  <m:sty m:val="p"/>
+                </m:rPr>
+                <m:t>,</m:t>
+              </m:r>
+              <m:sSup>
+                <m:e>
+                  <m:r>
+                    <m:t>σ</m:t>
+                  </m:r>
+                </m:e>
+                <m:sup>
+                  <m:r>
+                    <m:t>2</m:t>
+                  </m:r>
+                </m:sup>
+              </m:sSup>
+              <m:r>
+                <m:rPr>
+                  <m:sty m:val="p"/>
+                </m:rPr>
+                <m:t>)</m:t>
+              </m:r>
+            </m:oMath>
           </w:p>
         </w:tc>
       </w:tr>
@@ -1494,9 +1606,18 @@
             <w:pPr>
               <w:pStyle w:val="Compact"/>
             </w:pPr>
-            <w:r>
-              <w:t xml:space="preserve">$\vm$</w:t>
-            </w:r>
+            <m:oMath>
+              <m:acc>
+                <m:accPr>
+                  <m:chr m:val="̃"/>
+                </m:accPr>
+                <m:e>
+                  <m:r>
+                    <m:t>μ</m:t>
+                  </m:r>
+                </m:e>
+              </m:acc>
+            </m:oMath>
           </w:p>
         </w:tc>
       </w:tr>
@@ -1532,9 +1653,18 @@
             <w:pPr>
               <w:pStyle w:val="Compact"/>
             </w:pPr>
-            <w:r>
-              <w:t xml:space="preserve">$\hb$</w:t>
-            </w:r>
+            <m:oMath>
+              <m:acc>
+                <m:accPr>
+                  <m:chr m:val="̂"/>
+                </m:accPr>
+                <m:e>
+                  <m:r>
+                    <m:t>β</m:t>
+                  </m:r>
+                </m:e>
+              </m:acc>
+            </m:oMath>
           </w:p>
         </w:tc>
       </w:tr>
@@ -1734,9 +1864,11 @@
             <w:pPr>
               <w:pStyle w:val="Compact"/>
             </w:pPr>
-            <w:r>
-              <w:t xml:space="preserve">$\red{x}$</w:t>
-            </w:r>
+            <m:oMath>
+              <m:r>
+                <m:t>x</m:t>
+              </m:r>
+            </m:oMath>
           </w:p>
         </w:tc>
       </w:tr>
@@ -1772,9 +1904,11 @@
             <w:pPr>
               <w:pStyle w:val="Compact"/>
             </w:pPr>
-            <w:r>
-              <w:t xml:space="preserve">$\blue{y}$</w:t>
-            </w:r>
+            <m:oMath>
+              <m:r>
+                <m:t>y</m:t>
+              </m:r>
+            </m:oMath>
           </w:p>
         </w:tc>
       </w:tr>
@@ -1810,9 +1944,11 @@
             <w:pPr>
               <w:pStyle w:val="Compact"/>
             </w:pPr>
-            <w:r>
-              <w:t xml:space="preserve">$\green{z}$</w:t>
-            </w:r>
+            <m:oMath>
+              <m:r>
+                <m:t>z</m:t>
+              </m:r>
+            </m:oMath>
           </w:p>
         </w:tc>
       </w:tr>
@@ -1848,9 +1984,11 @@
             <w:pPr>
               <w:pStyle w:val="Compact"/>
             </w:pPr>
-            <w:r>
-              <w:t xml:space="preserve">$\orange{\mu}$</w:t>
-            </w:r>
+            <m:oMath>
+              <m:r>
+                <m:t>μ</m:t>
+              </m:r>
+            </m:oMath>
           </w:p>
         </w:tc>
       </w:tr>
@@ -1886,9 +2024,29 @@
             <w:pPr>
               <w:pStyle w:val="Compact"/>
             </w:pPr>
-            <w:r>
-              <w:t xml:space="preserve">$\red{x} + \blue{y} = \green{z}$</w:t>
-            </w:r>
+            <m:oMath>
+              <m:r>
+                <m:t>x</m:t>
+              </m:r>
+              <m:r>
+                <m:rPr>
+                  <m:sty m:val="p"/>
+                </m:rPr>
+                <m:t>+</m:t>
+              </m:r>
+              <m:r>
+                <m:t>y</m:t>
+              </m:r>
+              <m:r>
+                <m:rPr>
+                  <m:sty m:val="p"/>
+                </m:rPr>
+                <m:t>=</m:t>
+              </m:r>
+              <m:r>
+                <m:t>z</m:t>
+              </m:r>
+            </m:oMath>
           </w:p>
         </w:tc>
       </w:tr>
@@ -1924,9 +2082,101 @@
             <w:pPr>
               <w:pStyle w:val="Compact"/>
             </w:pPr>
-            <w:r>
-              <w:t xml:space="preserve">$X_i \sim_{\red{\ind}} \blue{\Normal}(\orange{\mu_i}, \green{\ss})$</w:t>
-            </w:r>
+            <m:oMath>
+              <m:sSub>
+                <m:e>
+                  <m:r>
+                    <m:t>X</m:t>
+                  </m:r>
+                </m:e>
+                <m:sub>
+                  <m:r>
+                    <m:t>i</m:t>
+                  </m:r>
+                </m:sub>
+              </m:sSub>
+              <m:sSub>
+                <m:e>
+                  <m:r>
+                    <m:rPr>
+                      <m:sty m:val="p"/>
+                    </m:rPr>
+                    <m:t>∼</m:t>
+                  </m:r>
+                </m:e>
+                <m:sub>
+                  <m:r>
+                    <m:rPr>
+                      <m:sty m:val="p"/>
+                    </m:rPr>
+                    <m:t>⟂</m:t>
+                  </m:r>
+                  <m:r>
+                    <m:t>​</m:t>
+                  </m:r>
+                  <m:r>
+                    <m:t>​</m:t>
+                  </m:r>
+                  <m:r>
+                    <m:t>​</m:t>
+                  </m:r>
+                  <m:r>
+                    <m:rPr>
+                      <m:sty m:val="p"/>
+                    </m:rPr>
+                    <m:t>⟂</m:t>
+                  </m:r>
+                </m:sub>
+              </m:sSub>
+              <m:r>
+                <m:rPr>
+                  <m:sty m:val="p"/>
+                </m:rPr>
+                <m:t>N</m:t>
+              </m:r>
+              <m:r>
+                <m:rPr>
+                  <m:sty m:val="p"/>
+                </m:rPr>
+                <m:t>(</m:t>
+              </m:r>
+              <m:sSub>
+                <m:e>
+                  <m:r>
+                    <m:t>μ</m:t>
+                  </m:r>
+                </m:e>
+                <m:sub>
+                  <m:r>
+                    <m:t>i</m:t>
+                  </m:r>
+                </m:sub>
+              </m:sSub>
+              <m:r>
+                <m:rPr>
+                  <m:sty m:val="p"/>
+                </m:rPr>
+                <m:t>,</m:t>
+              </m:r>
+              <m:sSup>
+                <m:e>
+                  <m:r>
+                    <m:t>σ</m:t>
+                  </m:r>
+                </m:e>
+                <m:sup>
+                  <m:r>
+                    <m:t>2</m:t>
+                  </m:r>
+                </m:sup>
+              </m:sSup>
+              <m:r>
+                <m:rPr>
+                  <m:sty m:val="p"/>
+                </m:rPr>
+                <m:t>)</m:t>
+              </m:r>
+            </m:oMath>
           </w:p>
         </w:tc>
       </w:tr>

</xml_diff>

<commit_message>
Deploying to gh-pages from @ d-morrison/macros@e2e94d433bd06106b03ac5c020aa80f3fc6eb874 🚀
</commit_message>
<xml_diff>
--- a/demo-include-in-header.docx
+++ b/demo-include-in-header.docx
@@ -1195,6 +1195,9 @@
                 <m:t>α</m:t>
               </m:r>
             </m:oMath>
+            <w:r>
+              <w:t xml:space="preserve">​</w:t>
+            </w:r>
           </w:p>
         </w:tc>
       </w:tr>
@@ -1235,6 +1238,9 @@
                 <m:t>β</m:t>
               </m:r>
             </m:oMath>
+            <w:r>
+              <w:t xml:space="preserve">​</w:t>
+            </w:r>
           </w:p>
         </w:tc>
       </w:tr>
@@ -1275,6 +1281,9 @@
                 <m:t>γ</m:t>
               </m:r>
             </m:oMath>
+            <w:r>
+              <w:t xml:space="preserve">​</w:t>
+            </w:r>
           </w:p>
         </w:tc>
       </w:tr>
@@ -1315,6 +1324,9 @@
                 <m:t>λ</m:t>
               </m:r>
             </m:oMath>
+            <w:r>
+              <w:t xml:space="preserve">​</w:t>
+            </w:r>
           </w:p>
         </w:tc>
       </w:tr>
@@ -1355,6 +1367,9 @@
                 <m:t>σ</m:t>
               </m:r>
             </m:oMath>
+            <w:r>
+              <w:t xml:space="preserve">​</w:t>
+            </w:r>
           </w:p>
         </w:tc>
       </w:tr>
@@ -1395,6 +1410,9 @@
                 <m:t>ℓ</m:t>
               </m:r>
             </m:oMath>
+            <w:r>
+              <w:t xml:space="preserve">​</w:t>
+            </w:r>
           </w:p>
         </w:tc>
       </w:tr>
@@ -1459,6 +1477,9 @@
                 <m:t>Y</m:t>
               </m:r>
             </m:oMath>
+            <w:r>
+              <w:t xml:space="preserve">​</w:t>
+            </w:r>
           </w:p>
         </w:tc>
       </w:tr>
@@ -1571,6 +1592,9 @@
                 <m:t>)</m:t>
               </m:r>
             </m:oMath>
+            <w:r>
+              <w:t xml:space="preserve">​</w:t>
+            </w:r>
           </w:p>
         </w:tc>
       </w:tr>
@@ -1618,6 +1642,9 @@
                 </m:e>
               </m:acc>
             </m:oMath>
+            <w:r>
+              <w:t xml:space="preserve">​</w:t>
+            </w:r>
           </w:p>
         </w:tc>
       </w:tr>
@@ -1665,6 +1692,9 @@
                 </m:e>
               </m:acc>
             </m:oMath>
+            <w:r>
+              <w:t xml:space="preserve">​</w:t>
+            </w:r>
           </w:p>
         </w:tc>
       </w:tr>
@@ -1869,6 +1899,9 @@
                 <m:t>x</m:t>
               </m:r>
             </m:oMath>
+            <w:r>
+              <w:t xml:space="preserve">​</w:t>
+            </w:r>
           </w:p>
         </w:tc>
       </w:tr>
@@ -1909,6 +1942,9 @@
                 <m:t>y</m:t>
               </m:r>
             </m:oMath>
+            <w:r>
+              <w:t xml:space="preserve">​</w:t>
+            </w:r>
           </w:p>
         </w:tc>
       </w:tr>
@@ -1949,6 +1985,9 @@
                 <m:t>z</m:t>
               </m:r>
             </m:oMath>
+            <w:r>
+              <w:t xml:space="preserve">​</w:t>
+            </w:r>
           </w:p>
         </w:tc>
       </w:tr>
@@ -1989,6 +2028,9 @@
                 <m:t>μ</m:t>
               </m:r>
             </m:oMath>
+            <w:r>
+              <w:t xml:space="preserve">​</w:t>
+            </w:r>
           </w:p>
         </w:tc>
       </w:tr>
@@ -2047,6 +2089,9 @@
                 <m:t>z</m:t>
               </m:r>
             </m:oMath>
+            <w:r>
+              <w:t xml:space="preserve">​</w:t>
+            </w:r>
           </w:p>
         </w:tc>
       </w:tr>
@@ -2177,6 +2222,9 @@
                 <m:t>)</m:t>
               </m:r>
             </m:oMath>
+            <w:r>
+              <w:t xml:space="preserve">​</w:t>
+            </w:r>
           </w:p>
         </w:tc>
       </w:tr>

</xml_diff>